<commit_message>
Update pipeline artifacts and add code-reviewer, flow-patterns, lwc-slds2
</commit_message>
<xml_diff>
--- a/PIPELINE-GUIDE.docx
+++ b/PIPELINE-GUIDE.docx
@@ -60,7 +60,7 @@
           <w:sz w:val="20"/>
           <w:szCs w:val="20"/>
         </w:rPr>
-        <w:t xml:space="preserve">Pilot feature F-001 slot-booking-core  ·  Version 1.0  ·  11 July 2026</w:t>
+        <w:t xml:space="preserve">Pilot feature F-001 slot-booking-core  ·  Version 1.1  ·  11 July 2026</w:t>
       </w:r>
     </w:p>
     <w:p>
@@ -415,7 +415,7 @@
           <w:sz w:val="18"/>
           <w:szCs w:val="18"/>
         </w:rPr>
-        <w:t xml:space="preserve">│   ├── agents/        7 role subagents (BA → QA)</w:t>
+        <w:t xml:space="preserve">│   ├── agents/        8 role subagents (BA → QA + code reviewer)</w:t>
       </w:r>
     </w:p>
     <w:p>
@@ -457,7 +457,7 @@
           <w:sz w:val="18"/>
           <w:szCs w:val="18"/>
         </w:rPr>
-        <w:t xml:space="preserve">│   ├── skills/        6 how-to skills (output formats &amp; patterns)</w:t>
+        <w:t xml:space="preserve">│   ├── skills/        8 how-to skills (formats, patterns, best practices)</w:t>
       </w:r>
     </w:p>
     <w:p>
@@ -2280,7 +2280,7 @@
                 <w:sz w:val="19"/>
                 <w:szCs w:val="19"/>
               </w:rPr>
-              <w:t xml:space="preserve">qa-lead</w:t>
+              <w:t xml:space="preserve">code-reviewer</w:t>
             </w:r>
           </w:p>
         </w:tc>
@@ -2305,7 +2305,7 @@
                 <w:sz w:val="19"/>
                 <w:szCs w:val="19"/>
               </w:rPr>
-              <w:t xml:space="preserve">QA Lead</w:t>
+              <w:t xml:space="preserve">Independent Code Reviewer</w:t>
             </w:r>
           </w:p>
         </w:tc>
@@ -2330,7 +2330,7 @@
                 <w:sz w:val="19"/>
                 <w:szCs w:val="19"/>
               </w:rPr>
-              <w:t xml:space="preserve">READY_FOR_QA / QA_IN_PROGRESS</w:t>
+              <w:t xml:space="preserve">DEV_IN_PROGRESS / DEV_COMPLETE</w:t>
             </w:r>
           </w:p>
         </w:tc>
@@ -2355,7 +2355,7 @@
                 <w:sz w:val="19"/>
                 <w:szCs w:val="19"/>
               </w:rPr>
-              <w:t xml:space="preserve">sonnet</w:t>
+              <w:t xml:space="preserve">opus</w:t>
             </w:r>
           </w:p>
         </w:tc>
@@ -2380,7 +2380,7 @@
                 <w:sz w:val="19"/>
                 <w:szCs w:val="19"/>
               </w:rPr>
-              <w:t xml:space="preserve">Read, Write, Grep, Glob</w:t>
+              <w:t xml:space="preserve">Read, Grep, Glob, Bash (no Write/Edit)</w:t>
             </w:r>
           </w:p>
         </w:tc>
@@ -2406,6 +2406,129 @@
                 <w:sz w:val="19"/>
                 <w:szCs w:val="19"/>
               </w:rPr>
+              <w:t xml:space="preserve">qa-lead</w:t>
+            </w:r>
+          </w:p>
+        </w:tc>
+        <w:tc>
+          <w:tcPr>
+            <w:tcW w:type="dxa" w:w="1900"/>
+            <w:tcMar>
+              <w:top w:type="dxa" w:w="60"/>
+              <w:left w:type="dxa" w:w="100"/>
+              <w:bottom w:type="dxa" w:w="60"/>
+              <w:right w:type="dxa" w:w="100"/>
+            </w:tcMar>
+          </w:tcPr>
+          <w:p>
+            <w:pPr>
+              <w:spacing w:after="0"/>
+            </w:pPr>
+            <w:r>
+              <w:rPr>
+                <w:rFonts w:ascii="Calibri" w:cs="Calibri" w:eastAsia="Calibri" w:hAnsi="Calibri"/>
+                <w:sz w:val="19"/>
+                <w:szCs w:val="19"/>
+              </w:rPr>
+              <w:t xml:space="preserve">QA Lead</w:t>
+            </w:r>
+          </w:p>
+        </w:tc>
+        <w:tc>
+          <w:tcPr>
+            <w:tcW w:type="dxa" w:w="2500"/>
+            <w:tcMar>
+              <w:top w:type="dxa" w:w="60"/>
+              <w:left w:type="dxa" w:w="100"/>
+              <w:bottom w:type="dxa" w:w="60"/>
+              <w:right w:type="dxa" w:w="100"/>
+            </w:tcMar>
+          </w:tcPr>
+          <w:p>
+            <w:pPr>
+              <w:spacing w:after="0"/>
+            </w:pPr>
+            <w:r>
+              <w:rPr>
+                <w:rFonts w:ascii="Calibri" w:cs="Calibri" w:eastAsia="Calibri" w:hAnsi="Calibri"/>
+                <w:sz w:val="19"/>
+                <w:szCs w:val="19"/>
+              </w:rPr>
+              <w:t xml:space="preserve">READY_FOR_QA / QA_IN_PROGRESS</w:t>
+            </w:r>
+          </w:p>
+        </w:tc>
+        <w:tc>
+          <w:tcPr>
+            <w:tcW w:type="dxa" w:w="950"/>
+            <w:tcMar>
+              <w:top w:type="dxa" w:w="60"/>
+              <w:left w:type="dxa" w:w="100"/>
+              <w:bottom w:type="dxa" w:w="60"/>
+              <w:right w:type="dxa" w:w="100"/>
+            </w:tcMar>
+          </w:tcPr>
+          <w:p>
+            <w:pPr>
+              <w:spacing w:after="0"/>
+            </w:pPr>
+            <w:r>
+              <w:rPr>
+                <w:rFonts w:ascii="Calibri" w:cs="Calibri" w:eastAsia="Calibri" w:hAnsi="Calibri"/>
+                <w:sz w:val="19"/>
+                <w:szCs w:val="19"/>
+              </w:rPr>
+              <w:t xml:space="preserve">sonnet</w:t>
+            </w:r>
+          </w:p>
+        </w:tc>
+        <w:tc>
+          <w:tcPr>
+            <w:tcW w:type="dxa" w:w="2500"/>
+            <w:tcMar>
+              <w:top w:type="dxa" w:w="60"/>
+              <w:left w:type="dxa" w:w="100"/>
+              <w:bottom w:type="dxa" w:w="60"/>
+              <w:right w:type="dxa" w:w="100"/>
+            </w:tcMar>
+          </w:tcPr>
+          <w:p>
+            <w:pPr>
+              <w:spacing w:after="0"/>
+            </w:pPr>
+            <w:r>
+              <w:rPr>
+                <w:rFonts w:ascii="Calibri" w:cs="Calibri" w:eastAsia="Calibri" w:hAnsi="Calibri"/>
+                <w:sz w:val="19"/>
+                <w:szCs w:val="19"/>
+              </w:rPr>
+              <w:t xml:space="preserve">Read, Write, Grep, Glob</w:t>
+            </w:r>
+          </w:p>
+        </w:tc>
+      </w:tr>
+      <w:tr>
+        <w:tc>
+          <w:tcPr>
+            <w:tcW w:type="dxa" w:w="1450"/>
+            <w:shd w:fill="F7F9FC" w:val="clear"/>
+            <w:tcMar>
+              <w:top w:type="dxa" w:w="60"/>
+              <w:left w:type="dxa" w:w="100"/>
+              <w:bottom w:type="dxa" w:w="60"/>
+              <w:right w:type="dxa" w:w="100"/>
+            </w:tcMar>
+          </w:tcPr>
+          <w:p>
+            <w:pPr>
+              <w:spacing w:after="0"/>
+            </w:pPr>
+            <w:r>
+              <w:rPr>
+                <w:rFonts w:ascii="Calibri" w:cs="Calibri" w:eastAsia="Calibri" w:hAnsi="Calibri"/>
+                <w:sz w:val="19"/>
+                <w:szCs w:val="19"/>
+              </w:rPr>
               <w:t xml:space="preserve">qa-engineer</w:t>
             </w:r>
           </w:p>
@@ -2413,6 +2536,7 @@
         <w:tc>
           <w:tcPr>
             <w:tcW w:type="dxa" w:w="1900"/>
+            <w:shd w:fill="F7F9FC" w:val="clear"/>
             <w:tcMar>
               <w:top w:type="dxa" w:w="60"/>
               <w:left w:type="dxa" w:w="100"/>
@@ -2437,6 +2561,7 @@
         <w:tc>
           <w:tcPr>
             <w:tcW w:type="dxa" w:w="2500"/>
+            <w:shd w:fill="F7F9FC" w:val="clear"/>
             <w:tcMar>
               <w:top w:type="dxa" w:w="60"/>
               <w:left w:type="dxa" w:w="100"/>
@@ -2461,6 +2586,7 @@
         <w:tc>
           <w:tcPr>
             <w:tcW w:type="dxa" w:w="950"/>
+            <w:shd w:fill="F7F9FC" w:val="clear"/>
             <w:tcMar>
               <w:top w:type="dxa" w:w="60"/>
               <w:left w:type="dxa" w:w="100"/>
@@ -2485,6 +2611,7 @@
         <w:tc>
           <w:tcPr>
             <w:tcW w:type="dxa" w:w="2500"/>
+            <w:shd w:fill="F7F9FC" w:val="clear"/>
             <w:tcMar>
               <w:top w:type="dxa" w:w="60"/>
               <w:left w:type="dxa" w:w="100"/>
@@ -2642,7 +2769,7 @@
         <w:rPr>
           <w:rFonts w:ascii="Calibri" w:cs="Calibri" w:eastAsia="Calibri" w:hAnsi="Calibri"/>
         </w:rPr>
-        <w:t xml:space="preserve">3.6 qa-lead — risk over coverage theatre</w:t>
+        <w:t xml:space="preserve">3.6 code-reviewer — independence by construction</w:t>
       </w:r>
     </w:p>
     <w:p>
@@ -2655,7 +2782,7 @@
           <w:sz w:val="22"/>
           <w:szCs w:val="22"/>
         </w:rPr>
-        <w:t xml:space="preserve">Turns design + tickets + drift-check into a risk-tiered test plan: Tier 1 (slot integrity, cut-off policy, no-Aadhaar, role visibility) runs first and blocks release. Splits scope into run A / run B for the engineers. At close-out, consolidates results into a GO / NO-GO recommendation.</w:t>
+        <w:t xml:space="preserve">Reviews each ticket's implementation before the human verdict. Its toolset deliberately excludes Write/Edit: it can read everything and run tests (sf apex run test), but can never fix code — so it has no stake in waving work through. Checks in priority order: correctness against the ticket's acceptance criteria; the §3.4 integrity path with hostile thinking ("how would I overbook this?", including unlocked paths around the service layer); security (sharing, CRUD/FLS, injection); compliance (no Aadhaar, C1-only fields, facility scoping); standards and the best-practice skills; and test quality, not just coverage numbers. Output: VS-##-code-review.md with findings ranked BLOCKER/MAJOR/MINOR/NIT, each with file:line evidence, ending in APPROVE or REQUEST-CHANGES. Zero findings is a legitimate outcome — it is instructed not to manufacture nits.</w:t>
       </w:r>
     </w:p>
     <w:p>
@@ -2667,7 +2794,7 @@
         <w:rPr>
           <w:rFonts w:ascii="Calibri" w:cs="Calibri" w:eastAsia="Calibri" w:hAnsi="Calibri"/>
         </w:rPr>
-        <w:t xml:space="preserve">3.7 qa-engineer — hands on the browser</w:t>
+        <w:t xml:space="preserve">3.7 qa-lead — risk over coverage theatre</w:t>
       </w:r>
     </w:p>
     <w:p>
@@ -2680,6 +2807,31 @@
           <w:sz w:val="22"/>
           <w:szCs w:val="22"/>
         </w:rPr>
+        <w:t xml:space="preserve">Turns design + tickets + drift-check into a risk-tiered test plan: Tier 1 (slot integrity, cut-off policy, no-Aadhaar, role visibility) runs first and blocks release. Splits scope into run A / run B for the engineers. At close-out, consolidates results into a GO / NO-GO recommendation.</w:t>
+      </w:r>
+    </w:p>
+    <w:p>
+      <w:pPr>
+        <w:pStyle w:val="Heading2"/>
+        <w:spacing w:after="120" w:before="240"/>
+      </w:pPr>
+      <w:r>
+        <w:rPr>
+          <w:rFonts w:ascii="Calibri" w:cs="Calibri" w:eastAsia="Calibri" w:hAnsi="Calibri"/>
+        </w:rPr>
+        <w:t xml:space="preserve">3.8 qa-engineer — hands on the browser</w:t>
+      </w:r>
+    </w:p>
+    <w:p>
+      <w:pPr>
+        <w:spacing w:after="120"/>
+      </w:pPr>
+      <w:r>
+        <w:rPr>
+          <w:rFonts w:ascii="Calibri" w:cs="Calibri" w:eastAsia="Calibri" w:hAnsi="Calibri"/>
+          <w:sz w:val="22"/>
+          <w:szCs w:val="22"/>
+        </w:rPr>
         <w:t xml:space="preserve">Executes assigned TC ranges against the scratch org through Playwright: evidence screenshot per test, a runnable regression spec per stable test, and a BUG-### report per failure with exact repro steps. Never marks PASS without evidence; synthetic data only.</w:t>
       </w:r>
     </w:p>
@@ -2705,7 +2857,7 @@
           <w:sz w:val="22"/>
           <w:szCs w:val="22"/>
         </w:rPr>
-        <w:t xml:space="preserve">Each agent pins a model in its frontmatter, so expensive reasoning is bought only where an error cascades downstream. Rule of thumb: Opus where mistakes multiply (analysis, architecture, concurrency-critical code), Sonnet where a skill or rubric already constrains the work, Haiku reserved for future mechanical helpers — none of the seven roles is safely mechanical.</w:t>
+        <w:t xml:space="preserve">Each agent pins a model in its frontmatter, so expensive reasoning is bought only where an error cascades downstream. Rule of thumb: Opus where mistakes multiply (analysis, architecture, concurrency-critical code, and the review that must catch their errors), Sonnet where a skill or rubric already constrains the work, Haiku reserved for future mechanical helpers — none of the eight roles is safely mechanical.</w:t>
       </w:r>
     </w:p>
     <w:tbl>
@@ -3061,7 +3213,7 @@
                 <w:sz w:val="19"/>
                 <w:szCs w:val="19"/>
               </w:rPr>
-              <w:t xml:space="preserve">pm-planner</w:t>
+              <w:t xml:space="preserve">code-reviewer</w:t>
             </w:r>
           </w:p>
         </w:tc>
@@ -3086,7 +3238,7 @@
                 <w:sz w:val="19"/>
                 <w:szCs w:val="19"/>
               </w:rPr>
-              <w:t xml:space="preserve">sonnet</w:t>
+              <w:t xml:space="preserve">opus</w:t>
             </w:r>
           </w:p>
         </w:tc>
@@ -3111,7 +3263,7 @@
                 <w:sz w:val="19"/>
                 <w:szCs w:val="19"/>
               </w:rPr>
-              <w:t xml:space="preserve">Structured decomposition against an explicit ticket format and routing rubric.</w:t>
+              <w:t xml:space="preserve">The last line of defense before human sign-off; a missed race condition or compliance hole costs far more than the tokens.</w:t>
             </w:r>
           </w:p>
         </w:tc>
@@ -3137,7 +3289,7 @@
                 <w:sz w:val="19"/>
                 <w:szCs w:val="19"/>
               </w:rPr>
-              <w:t xml:space="preserve">dev-mid</w:t>
+              <w:t xml:space="preserve">pm-planner</w:t>
             </w:r>
           </w:p>
         </w:tc>
@@ -3185,7 +3337,7 @@
                 <w:sz w:val="19"/>
                 <w:szCs w:val="19"/>
               </w:rPr>
-              <w:t xml:space="preserve">High token volume (metadata XML, Flows) where format discipline matters more than deep reasoning.</w:t>
+              <w:t xml:space="preserve">Structured decomposition against an explicit ticket format and routing rubric.</w:t>
             </w:r>
           </w:p>
         </w:tc>
@@ -3212,7 +3364,7 @@
                 <w:sz w:val="19"/>
                 <w:szCs w:val="19"/>
               </w:rPr>
-              <w:t xml:space="preserve">qa-lead</w:t>
+              <w:t xml:space="preserve">dev-mid</w:t>
             </w:r>
           </w:p>
         </w:tc>
@@ -3262,7 +3414,7 @@
                 <w:sz w:val="19"/>
                 <w:szCs w:val="19"/>
               </w:rPr>
-              <w:t xml:space="preserve">Plan derives mechanically from design + risk tiers already defined in rules.</w:t>
+              <w:t xml:space="preserve">High token volume (metadata XML, Flows) where format discipline matters more than deep reasoning.</w:t>
             </w:r>
           </w:p>
         </w:tc>
@@ -3288,6 +3440,81 @@
                 <w:sz w:val="19"/>
                 <w:szCs w:val="19"/>
               </w:rPr>
+              <w:t xml:space="preserve">qa-lead</w:t>
+            </w:r>
+          </w:p>
+        </w:tc>
+        <w:tc>
+          <w:tcPr>
+            <w:tcW w:type="dxa" w:w="1000"/>
+            <w:tcMar>
+              <w:top w:type="dxa" w:w="60"/>
+              <w:left w:type="dxa" w:w="100"/>
+              <w:bottom w:type="dxa" w:w="60"/>
+              <w:right w:type="dxa" w:w="100"/>
+            </w:tcMar>
+          </w:tcPr>
+          <w:p>
+            <w:pPr>
+              <w:spacing w:after="0"/>
+            </w:pPr>
+            <w:r>
+              <w:rPr>
+                <w:rFonts w:ascii="Calibri" w:cs="Calibri" w:eastAsia="Calibri" w:hAnsi="Calibri"/>
+                <w:sz w:val="19"/>
+                <w:szCs w:val="19"/>
+              </w:rPr>
+              <w:t xml:space="preserve">sonnet</w:t>
+            </w:r>
+          </w:p>
+        </w:tc>
+        <w:tc>
+          <w:tcPr>
+            <w:tcW w:type="dxa" w:w="6800"/>
+            <w:tcMar>
+              <w:top w:type="dxa" w:w="60"/>
+              <w:left w:type="dxa" w:w="100"/>
+              <w:bottom w:type="dxa" w:w="60"/>
+              <w:right w:type="dxa" w:w="100"/>
+            </w:tcMar>
+          </w:tcPr>
+          <w:p>
+            <w:pPr>
+              <w:spacing w:after="0"/>
+            </w:pPr>
+            <w:r>
+              <w:rPr>
+                <w:rFonts w:ascii="Calibri" w:cs="Calibri" w:eastAsia="Calibri" w:hAnsi="Calibri"/>
+                <w:sz w:val="19"/>
+                <w:szCs w:val="19"/>
+              </w:rPr>
+              <w:t xml:space="preserve">Plan derives mechanically from design + risk tiers already defined in rules.</w:t>
+            </w:r>
+          </w:p>
+        </w:tc>
+      </w:tr>
+      <w:tr>
+        <w:tc>
+          <w:tcPr>
+            <w:tcW w:type="dxa" w:w="1500"/>
+            <w:shd w:fill="F7F9FC" w:val="clear"/>
+            <w:tcMar>
+              <w:top w:type="dxa" w:w="60"/>
+              <w:left w:type="dxa" w:w="100"/>
+              <w:bottom w:type="dxa" w:w="60"/>
+              <w:right w:type="dxa" w:w="100"/>
+            </w:tcMar>
+          </w:tcPr>
+          <w:p>
+            <w:pPr>
+              <w:spacing w:after="0"/>
+            </w:pPr>
+            <w:r>
+              <w:rPr>
+                <w:rFonts w:ascii="Calibri" w:cs="Calibri" w:eastAsia="Calibri" w:hAnsi="Calibri"/>
+                <w:sz w:val="19"/>
+                <w:szCs w:val="19"/>
+              </w:rPr>
               <w:t xml:space="preserve">qa-engineer</w:t>
             </w:r>
           </w:p>
@@ -3295,6 +3522,7 @@
         <w:tc>
           <w:tcPr>
             <w:tcW w:type="dxa" w:w="1000"/>
+            <w:shd w:fill="F7F9FC" w:val="clear"/>
             <w:tcMar>
               <w:top w:type="dxa" w:w="60"/>
               <w:left w:type="dxa" w:w="100"/>
@@ -3319,6 +3547,7 @@
         <w:tc>
           <w:tcPr>
             <w:tcW w:type="dxa" w:w="6800"/>
+            <w:shd w:fill="F7F9FC" w:val="clear"/>
             <w:tcMar>
               <w:top w:type="dxa" w:w="60"/>
               <w:left w:type="dxa" w:w="100"/>
@@ -4102,7 +4331,7 @@
                 <w:sz w:val="19"/>
                 <w:szCs w:val="19"/>
               </w:rPr>
-              <w:t xml:space="preserve">Walks you through the review packet; records your verdict</w:t>
+              <w:t xml:space="preserve">Runs the code-reviewer agent, presents its findings, records your verdict</w:t>
             </w:r>
           </w:p>
         </w:tc>
@@ -4717,7 +4946,7 @@
           <w:sz w:val="22"/>
           <w:szCs w:val="22"/>
         </w:rPr>
-        <w:t xml:space="preserve">This is where the human developer stays in charge: APPROVED or CHANGES-REQUESTED goes into the packet and the ticket log.</w:t>
+        <w:t xml:space="preserve">The code-reviewer agent (Opus, read-only by design) does the deep pass first — AC verification, §3.4 hostile review, security, compliance, test quality — and hands you severity-ranked findings with file:line evidence. You stay in charge: APPROVED or CHANGES-REQUESTED goes into the packet and the ticket log. A §3.4 BLOCKER is echoed to the handoff notes so drift check and QA inherit it.</w:t>
       </w:r>
     </w:p>
     <w:p>
@@ -4903,7 +5132,7 @@
           <w:sz w:val="22"/>
           <w:szCs w:val="22"/>
         </w:rPr>
-        <w:t xml:space="preserve">/dev-implement VS-01 … VS-nn, with /dev-review after each</w:t>
+        <w:t xml:space="preserve">/dev-implement VS-01 … VS-nn, with /dev-review after each (code-reviewer pass + your verdict)</w:t>
       </w:r>
     </w:p>
     <w:p>
@@ -5312,7 +5541,7 @@
           <w:sz w:val="22"/>
           <w:szCs w:val="22"/>
         </w:rPr>
-        <w:t xml:space="preserve">Skills are how-to knowledge — output formats and technical patterns — loaded by the agent that needs them, when it needs them. This keeps agent prompts short and output formats consistent.</w:t>
+        <w:t xml:space="preserve">Skills are how-to knowledge — output formats, technical patterns, and development best practices — loaded by the agent that needs them, when it needs them. This keeps agent prompts short and output formats consistent. Rules stay binding law; skills are craft: on any conflict, rules/20 wins. To add your own standards later, drop a reference file into the matching skill folder and add one pointer line in its SKILL.md.</w:t>
       </w:r>
     </w:p>
     <w:tbl>
@@ -5693,7 +5922,7 @@
                 <w:sz w:val="19"/>
                 <w:szCs w:val="19"/>
               </w:rPr>
-              <w:t xml:space="preserve">dev-senior, dev-mid</w:t>
+              <w:t xml:space="preserve">dev-senior, dev-mid, code-reviewer</w:t>
             </w:r>
           </w:p>
         </w:tc>
@@ -5718,7 +5947,158 @@
                 <w:sz w:val="19"/>
                 <w:szCs w:val="19"/>
               </w:rPr>
-              <w:t xml:space="preserve">The VS_BookingService FOR UPDATE pattern with code and the explanation of why it passes §3.4; trigger→handler→service shape; idempotent async; SMS provider interface; capacity-exhaustion test pattern.</w:t>
+              <w:t xml:space="preserve">The VS_BookingService FOR UPDATE pattern with code and why it passes §3.4; trigger→handler→service shape; idempotent async; SMS provider interface; capacity-exhaustion test pattern. Plus references/apex-best-practices.md: trigger handler pattern with recursion guards, bulkification and governor limits, error handling with message codes, security (USER_MODE, sharing, injection), Queueable/Finalizer patterns, test discipline (runAs per persona, negative paths).</w:t>
+            </w:r>
+          </w:p>
+        </w:tc>
+      </w:tr>
+      <w:tr>
+        <w:tc>
+          <w:tcPr>
+            <w:tcW w:type="dxa" w:w="2100"/>
+            <w:tcMar>
+              <w:top w:type="dxa" w:w="60"/>
+              <w:left w:type="dxa" w:w="100"/>
+              <w:bottom w:type="dxa" w:w="60"/>
+              <w:right w:type="dxa" w:w="100"/>
+            </w:tcMar>
+          </w:tcPr>
+          <w:p>
+            <w:pPr>
+              <w:spacing w:after="0"/>
+            </w:pPr>
+            <w:r>
+              <w:rPr>
+                <w:rFonts w:ascii="Calibri" w:cs="Calibri" w:eastAsia="Calibri" w:hAnsi="Calibri"/>
+                <w:sz w:val="19"/>
+                <w:szCs w:val="19"/>
+              </w:rPr>
+              <w:t xml:space="preserve">lwc-slds2</w:t>
+            </w:r>
+          </w:p>
+        </w:tc>
+        <w:tc>
+          <w:tcPr>
+            <w:tcW w:type="dxa" w:w="1700"/>
+            <w:tcMar>
+              <w:top w:type="dxa" w:w="60"/>
+              <w:left w:type="dxa" w:w="100"/>
+              <w:bottom w:type="dxa" w:w="60"/>
+              <w:right w:type="dxa" w:w="100"/>
+            </w:tcMar>
+          </w:tcPr>
+          <w:p>
+            <w:pPr>
+              <w:spacing w:after="0"/>
+            </w:pPr>
+            <w:r>
+              <w:rPr>
+                <w:rFonts w:ascii="Calibri" w:cs="Calibri" w:eastAsia="Calibri" w:hAnsi="Calibri"/>
+                <w:sz w:val="19"/>
+                <w:szCs w:val="19"/>
+              </w:rPr>
+              <w:t xml:space="preserve">dev-senior, dev-mid, code-reviewer</w:t>
+            </w:r>
+          </w:p>
+        </w:tc>
+        <w:tc>
+          <w:tcPr>
+            <w:tcW w:type="dxa" w:w="5500"/>
+            <w:tcMar>
+              <w:top w:type="dxa" w:w="60"/>
+              <w:left w:type="dxa" w:w="100"/>
+              <w:bottom w:type="dxa" w:w="60"/>
+              <w:right w:type="dxa" w:w="100"/>
+            </w:tcMar>
+          </w:tcPr>
+          <w:p>
+            <w:pPr>
+              <w:spacing w:after="0"/>
+            </w:pPr>
+            <w:r>
+              <w:rPr>
+                <w:rFonts w:ascii="Calibri" w:cs="Calibri" w:eastAsia="Calibri" w:hAnsi="Calibri"/>
+                <w:sz w:val="19"/>
+                <w:szCs w:val="19"/>
+              </w:rPr>
+              <w:t xml:space="preserve">LWC best practices across HTML (semantics, lwc:if, stable keys), JS (@api down / events up, debounce, disable-while-in-flight, no hardcoded copy, data-testid for QA) and CSS. SLDS 2 rules: style with global --slds-g-* styling hooks only; design tokens and --slds-c-* hooks are dead; never override base-component internals; slds-linter before review. WCAG 2.1 AA, one-thumb targets, 3G-friendly loading.</w:t>
+            </w:r>
+          </w:p>
+        </w:tc>
+      </w:tr>
+      <w:tr>
+        <w:tc>
+          <w:tcPr>
+            <w:tcW w:type="dxa" w:w="2100"/>
+            <w:shd w:fill="F7F9FC" w:val="clear"/>
+            <w:tcMar>
+              <w:top w:type="dxa" w:w="60"/>
+              <w:left w:type="dxa" w:w="100"/>
+              <w:bottom w:type="dxa" w:w="60"/>
+              <w:right w:type="dxa" w:w="100"/>
+            </w:tcMar>
+          </w:tcPr>
+          <w:p>
+            <w:pPr>
+              <w:spacing w:after="0"/>
+            </w:pPr>
+            <w:r>
+              <w:rPr>
+                <w:rFonts w:ascii="Calibri" w:cs="Calibri" w:eastAsia="Calibri" w:hAnsi="Calibri"/>
+                <w:sz w:val="19"/>
+                <w:szCs w:val="19"/>
+              </w:rPr>
+              <w:t xml:space="preserve">flow-patterns</w:t>
+            </w:r>
+          </w:p>
+        </w:tc>
+        <w:tc>
+          <w:tcPr>
+            <w:tcW w:type="dxa" w:w="1700"/>
+            <w:shd w:fill="F7F9FC" w:val="clear"/>
+            <w:tcMar>
+              <w:top w:type="dxa" w:w="60"/>
+              <w:left w:type="dxa" w:w="100"/>
+              <w:bottom w:type="dxa" w:w="60"/>
+              <w:right w:type="dxa" w:w="100"/>
+            </w:tcMar>
+          </w:tcPr>
+          <w:p>
+            <w:pPr>
+              <w:spacing w:after="0"/>
+            </w:pPr>
+            <w:r>
+              <w:rPr>
+                <w:rFonts w:ascii="Calibri" w:cs="Calibri" w:eastAsia="Calibri" w:hAnsi="Calibri"/>
+                <w:sz w:val="19"/>
+                <w:szCs w:val="19"/>
+              </w:rPr>
+              <w:t xml:space="preserve">dev-mid, architect, code-reviewer</w:t>
+            </w:r>
+          </w:p>
+        </w:tc>
+        <w:tc>
+          <w:tcPr>
+            <w:tcW w:type="dxa" w:w="5500"/>
+            <w:shd w:fill="F7F9FC" w:val="clear"/>
+            <w:tcMar>
+              <w:top w:type="dxa" w:w="60"/>
+              <w:left w:type="dxa" w:w="100"/>
+              <w:bottom w:type="dxa" w:w="60"/>
+              <w:right w:type="dxa" w:w="100"/>
+            </w:tcMar>
+          </w:tcPr>
+          <w:p>
+            <w:pPr>
+              <w:spacing w:after="0"/>
+            </w:pPr>
+            <w:r>
+              <w:rPr>
+                <w:rFonts w:ascii="Calibri" w:cs="Calibri" w:eastAsia="Calibri" w:hAnsi="Calibri"/>
+                <w:sz w:val="19"/>
+                <w:szCs w:val="19"/>
+              </w:rPr>
+              <w:t xml:space="preserve">When to use which flow type; the Apex-vs-Flow boundary (one owner per business rule — booking stays in Apex because of the lock); bulk-safe structure (no DML in loops); mandatory fault paths into the shared error log; VS_ flow naming; flow tests; deploy-active policy for the POC.</w:t>
             </w:r>
           </w:p>
         </w:tc>
@@ -6453,7 +6833,7 @@
           <w:sz w:val="22"/>
           <w:szCs w:val="22"/>
         </w:rPr>
-        <w:t xml:space="preserve">Optional but recommended for later phases: authenticate the scratch org (sf org login web), and connect the Atlassian and Playwright MCP servers — Discovery needs neither.</w:t>
+        <w:t xml:space="preserve">Optional for later phases: authenticate the scratch org (sf org login web) and connect the Atlassian and Playwright MCP servers — Discovery needs none of them. Jira is currently deferred by decision D-004: jira-log.md is the ticket source of truth until the Atlassian MCP is connected (claude mcp add --transport http atlassian https://mcp.atlassian.com/v1/mcp/authv2, then /mcp to sign in).</w:t>
       </w:r>
     </w:p>
     <w:p>

</xml_diff>